<commit_message>
Add CSS files for DIW exercises and update index.html
</commit_message>
<xml_diff>
--- a/asignaturas/DIW/Lunes 14 octubre/ejercicio 10 de octubre.docx
+++ b/asignaturas/DIW/Lunes 14 octubre/ejercicio 10 de octubre.docx
@@ -115,14 +115,12 @@
         </w:rPr>
         <w:t xml:space="preserve">Ejercicio1 (punto de </w:t>
       </w:r>
-      <w:proofErr w:type="gramStart"/>
       <w:r>
         <w:rPr>
           <w:color w:val="FF0000"/>
         </w:rPr>
-        <w:t>corte ,</w:t>
-      </w:r>
-      <w:proofErr w:type="gramEnd"/>
+        <w:t>corte,</w:t>
+      </w:r>
       <w:r>
         <w:rPr>
           <w:color w:val="FF0000"/>
@@ -199,7 +197,7 @@
               </wp:anchor>
             </w:drawing>
           </mc:Choice>
-          <mc:Fallback xmlns:w16sdtdh="http://schemas.microsoft.com/office/word/2020/wordml/sdtdatahash" xmlns:w16="http://schemas.microsoft.com/office/word/2018/wordml" xmlns:w16cex="http://schemas.microsoft.com/office/word/2018/wordml/cex" xmlns:oel="http://schemas.microsoft.com/office/2019/extlst">
+          <mc:Fallback xmlns:oel="http://schemas.microsoft.com/office/2019/extlst" xmlns:w16cex="http://schemas.microsoft.com/office/word/2018/wordml/cex" xmlns:w16="http://schemas.microsoft.com/office/word/2018/wordml" xmlns:w16sdtdh="http://schemas.microsoft.com/office/word/2020/wordml/sdtdatahash">
             <w:pict>
               <v:rect w14:anchorId="30157419" id="Rectángulo 1" o:spid="_x0000_s1026" style="position:absolute;margin-left:20.75pt;margin-top:11.3pt;width:206.9pt;height:113.3pt;z-index:251659264;visibility:visible;mso-wrap-style:square;mso-width-percent:0;mso-wrap-distance-left:9pt;mso-wrap-distance-top:0;mso-wrap-distance-right:9pt;mso-wrap-distance-bottom:0;mso-position-horizontal:absolute;mso-position-horizontal-relative:text;mso-position-vertical:absolute;mso-position-vertical-relative:text;mso-width-percent:0;mso-width-relative:margin;v-text-anchor:middle" o:gfxdata="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" fillcolor="white [3201]" strokecolor="#4472c4 [3204]" strokeweight="1pt"/>
             </w:pict>
@@ -719,7 +717,10 @@
         </w:rPr>
       </w:pPr>
     </w:p>
-    <w:p/>
+    <w:p>
+      <w:bookmarkStart w:id="0" w:name="_GoBack"/>
+      <w:bookmarkEnd w:id="0"/>
+    </w:p>
     <w:p/>
     <w:p/>
     <w:p>
@@ -791,7 +792,7 @@
               </wp:anchor>
             </w:drawing>
           </mc:Choice>
-          <mc:Fallback xmlns:w16sdtdh="http://schemas.microsoft.com/office/word/2020/wordml/sdtdatahash" xmlns:w16="http://schemas.microsoft.com/office/word/2018/wordml" xmlns:w16cex="http://schemas.microsoft.com/office/word/2018/wordml/cex" xmlns:oel="http://schemas.microsoft.com/office/2019/extlst">
+          <mc:Fallback xmlns:oel="http://schemas.microsoft.com/office/2019/extlst" xmlns:w16cex="http://schemas.microsoft.com/office/word/2018/wordml/cex" xmlns:w16="http://schemas.microsoft.com/office/word/2018/wordml" xmlns:w16sdtdh="http://schemas.microsoft.com/office/word/2020/wordml/sdtdatahash">
             <w:pict>
               <v:rect w14:anchorId="764ACCD0" id="Rectángulo 7" o:spid="_x0000_s1026" style="position:absolute;margin-left:22.4pt;margin-top:6.2pt;width:206.9pt;height:113.3pt;z-index:251668480;visibility:visible;mso-wrap-style:square;mso-width-percent:0;mso-wrap-distance-left:9pt;mso-wrap-distance-top:0;mso-wrap-distance-right:9pt;mso-wrap-distance-bottom:0;mso-position-horizontal:absolute;mso-position-horizontal-relative:text;mso-position-vertical:absolute;mso-position-vertical-relative:text;mso-width-percent:0;mso-width-relative:margin;v-text-anchor:middle" o:gfxdata="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" fillcolor="white [3201]" strokecolor="#4472c4 [3204]" strokeweight="1pt"/>
             </w:pict>
@@ -1489,7 +1490,7 @@
               </wp:anchor>
             </w:drawing>
           </mc:Choice>
-          <mc:Fallback xmlns:w16sdtdh="http://schemas.microsoft.com/office/word/2020/wordml/sdtdatahash" xmlns:w16="http://schemas.microsoft.com/office/word/2018/wordml" xmlns:w16cex="http://schemas.microsoft.com/office/word/2018/wordml/cex" xmlns:oel="http://schemas.microsoft.com/office/2019/extlst">
+          <mc:Fallback xmlns:oel="http://schemas.microsoft.com/office/2019/extlst" xmlns:w16cex="http://schemas.microsoft.com/office/word/2018/wordml/cex" xmlns:w16="http://schemas.microsoft.com/office/word/2018/wordml" xmlns:w16sdtdh="http://schemas.microsoft.com/office/word/2020/wordml/sdtdatahash">
             <w:pict>
               <v:rect w14:anchorId="64CA0323" id="Rectángulo 12" o:spid="_x0000_s1026" style="position:absolute;margin-left:-.1pt;margin-top:22.35pt;width:277.75pt;height:113.3pt;z-index:251678720;visibility:visible;mso-wrap-style:square;mso-width-percent:0;mso-wrap-distance-left:9pt;mso-wrap-distance-top:0;mso-wrap-distance-right:9pt;mso-wrap-distance-bottom:0;mso-position-horizontal:absolute;mso-position-horizontal-relative:margin;mso-position-vertical:absolute;mso-position-vertical-relative:text;mso-width-percent:0;mso-width-relative:margin;v-text-anchor:middle" o:gfxdata="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" fillcolor="white [3201]" strokecolor="#4472c4 [3204]" strokeweight="1pt">
                 <w10:wrap anchorx="margin"/>
@@ -2589,7 +2590,7 @@
               </wp:anchor>
             </w:drawing>
           </mc:Choice>
-          <mc:Fallback xmlns:w16sdtdh="http://schemas.microsoft.com/office/word/2020/wordml/sdtdatahash" xmlns:w16="http://schemas.microsoft.com/office/word/2018/wordml" xmlns:w16cex="http://schemas.microsoft.com/office/word/2018/wordml/cex" xmlns:oel="http://schemas.microsoft.com/office/2019/extlst">
+          <mc:Fallback xmlns:oel="http://schemas.microsoft.com/office/2019/extlst" xmlns:w16cex="http://schemas.microsoft.com/office/word/2018/wordml/cex" xmlns:w16="http://schemas.microsoft.com/office/word/2018/wordml" xmlns:w16sdtdh="http://schemas.microsoft.com/office/word/2020/wordml/sdtdatahash">
             <w:pict>
               <v:rect w14:anchorId="33F85602" id="Rectángulo 17" o:spid="_x0000_s1026" style="position:absolute;margin-left:3.35pt;margin-top:10.35pt;width:206.9pt;height:113.3pt;z-index:251684864;visibility:visible;mso-wrap-style:square;mso-width-percent:0;mso-wrap-distance-left:9pt;mso-wrap-distance-top:0;mso-wrap-distance-right:9pt;mso-wrap-distance-bottom:0;mso-position-horizontal:absolute;mso-position-horizontal-relative:text;mso-position-vertical:absolute;mso-position-vertical-relative:text;mso-width-percent:0;mso-width-relative:margin;v-text-anchor:middle" o:gfxdata="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" fillcolor="white [3201]" strokecolor="#4472c4 [3204]" strokeweight="1pt"/>
             </w:pict>
@@ -2842,16 +2843,11 @@
       <w:tab/>
     </w:r>
     <w:r>
-      <w:t xml:space="preserve">Ejercicio </w:t>
-    </w:r>
-    <w:r>
-      <w:t>1</w:t>
+      <w:t>Ejercicio 1</w:t>
     </w:r>
     <w:r>
       <w:t>4</w:t>
     </w:r>
-    <w:bookmarkStart w:id="0" w:name="_GoBack"/>
-    <w:bookmarkEnd w:id="0"/>
     <w:r>
       <w:t xml:space="preserve"> de Octubre</w:t>
     </w:r>

</xml_diff>